<commit_message>
Redige Código de Conduta e Política de Proteção de Crianças, Adolescentes e Vulneráveis
Inclui termos e formulários anexos, remissões ao Regimento Interno no gerador
e atualiza o Regimento (certidões conforme ECA art. 59-A; Lei 9.504 art. 37, §4º).

Co-Authored-By: Claude Opus 5.5 <noreply@anthropic.com>
Claude-Session: https://claude.ai/code/session_01BEp8NqqHQWjkMmYzbfUpgC
</commit_message>
<xml_diff>
--- a/estatuto-igreja/Regimento_Interno_Igreja_ISAC.docx
+++ b/estatuto-igreja/Regimento_Interno_Igreja_ISAC.docx
@@ -2840,7 +2840,7 @@
           <w:b w:val="0"/>
           <w:i w:val="0"/>
         </w:rPr>
-        <w:t>Em observância ao art. 4º, § 3º, do Estatuto Social e à legislação eleitoral, que considera os templos bens de uso comum para fins eleitorais (Lei nº 9.504/1997), é vedado:</w:t>
+        <w:t>Em observância ao art. 4º, § 3º, do Estatuto Social e à legislação eleitoral, que considera os templos bens de uso comum para fins eleitorais (Lei nº 9.504/1997, art. 37, § 4º), é vedado:</w:t>
       </w:r>
     </w:p>
     <w:p>
@@ -2954,7 +2954,7 @@
           <w:b w:val="0"/>
           <w:i w:val="0"/>
         </w:rPr>
-        <w:t>I – os voluntários e empregados que atuem com esses públicos serão membros da IGREJA há pelo menos [6 (SEIS)] meses, apresentarão certidões criminais atualizadas a cada 2 (dois) anos e participarão de capacitação específica;</w:t>
+        <w:t>I – os voluntários e empregados que atuem com esses públicos serão membros da IGREJA há pelo menos [6 (SEIS)] meses, apresentarão certidões de antecedentes criminais atualizadas na periodicidade fixada pela Política de Proteção, não superior a 12 (doze) meses, ou a cada 6 (seis) meses quando a IGREJA receber recursos públicos para atividades com crianças e adolescentes (Estatuto da Criança e do Adolescente, art. 59-A), e participarão de capacitação específica;</w:t>
       </w:r>
     </w:p>
     <w:p>

</xml_diff>